<commit_message>
Remove 'no GPU' from slides and report
</commit_message>
<xml_diff>
--- a/report/main.docx
+++ b/report/main.docx
@@ -196,7 +196,7 @@
       <w:r>
         <w:fldChar w:fldCharType="separate"/>
       </w:r>
-      <w:hyperlink w:anchor="_Toc243114480" w:history="1">
+      <w:hyperlink w:anchor="_Toc243121287" w:history="1">
         <w:r>
           <w:rPr>
             <w:rStyle w:val="Hyperlink"/>
@@ -223,7 +223,7 @@
             <w:noProof/>
             <w:webHidden/>
           </w:rPr>
-          <w:instrText xml:space="preserve"> PAGEREF _Toc243114480 \h </w:instrText>
+          <w:instrText xml:space="preserve"> PAGEREF _Toc243121287 \h </w:instrText>
         </w:r>
         <w:r>
           <w:rPr>
@@ -264,7 +264,7 @@
           <w:noProof/>
         </w:rPr>
       </w:pPr>
-      <w:hyperlink w:anchor="_Toc243114481" w:history="1">
+      <w:hyperlink w:anchor="_Toc243121288" w:history="1">
         <w:r>
           <w:rPr>
             <w:rStyle w:val="Hyperlink"/>
@@ -291,7 +291,7 @@
             <w:noProof/>
             <w:webHidden/>
           </w:rPr>
-          <w:instrText xml:space="preserve"> PAGEREF _Toc243114481 \h </w:instrText>
+          <w:instrText xml:space="preserve"> PAGEREF _Toc243121288 \h </w:instrText>
         </w:r>
         <w:r>
           <w:rPr>
@@ -332,7 +332,7 @@
           <w:noProof/>
         </w:rPr>
       </w:pPr>
-      <w:hyperlink w:anchor="_Toc243114482" w:history="1">
+      <w:hyperlink w:anchor="_Toc243121289" w:history="1">
         <w:r>
           <w:rPr>
             <w:rStyle w:val="Hyperlink"/>
@@ -359,7 +359,7 @@
             <w:noProof/>
             <w:webHidden/>
           </w:rPr>
-          <w:instrText xml:space="preserve"> PAGEREF _Toc243114482 \h </w:instrText>
+          <w:instrText xml:space="preserve"> PAGEREF _Toc243121289 \h </w:instrText>
         </w:r>
         <w:r>
           <w:rPr>
@@ -400,7 +400,7 @@
           <w:noProof/>
         </w:rPr>
       </w:pPr>
-      <w:hyperlink w:anchor="_Toc243114483" w:history="1">
+      <w:hyperlink w:anchor="_Toc243121290" w:history="1">
         <w:r>
           <w:rPr>
             <w:rStyle w:val="Hyperlink"/>
@@ -427,7 +427,7 @@
             <w:noProof/>
             <w:webHidden/>
           </w:rPr>
-          <w:instrText xml:space="preserve"> PAGEREF _Toc243114483 \h </w:instrText>
+          <w:instrText xml:space="preserve"> PAGEREF _Toc243121290 \h </w:instrText>
         </w:r>
         <w:r>
           <w:rPr>
@@ -468,7 +468,7 @@
           <w:noProof/>
         </w:rPr>
       </w:pPr>
-      <w:hyperlink w:anchor="_Toc243114484" w:history="1">
+      <w:hyperlink w:anchor="_Toc243121291" w:history="1">
         <w:r>
           <w:rPr>
             <w:rStyle w:val="Hyperlink"/>
@@ -495,7 +495,7 @@
             <w:noProof/>
             <w:webHidden/>
           </w:rPr>
-          <w:instrText xml:space="preserve"> PAGEREF _Toc243114484 \h </w:instrText>
+          <w:instrText xml:space="preserve"> PAGEREF _Toc243121291 \h </w:instrText>
         </w:r>
         <w:r>
           <w:rPr>
@@ -536,7 +536,7 @@
           <w:noProof/>
         </w:rPr>
       </w:pPr>
-      <w:hyperlink w:anchor="_Toc243114485" w:history="1">
+      <w:hyperlink w:anchor="_Toc243121292" w:history="1">
         <w:r>
           <w:rPr>
             <w:rStyle w:val="Hyperlink"/>
@@ -563,7 +563,7 @@
             <w:noProof/>
             <w:webHidden/>
           </w:rPr>
-          <w:instrText xml:space="preserve"> PAGEREF _Toc243114485 \h </w:instrText>
+          <w:instrText xml:space="preserve"> PAGEREF _Toc243121292 \h </w:instrText>
         </w:r>
         <w:r>
           <w:rPr>
@@ -604,7 +604,7 @@
           <w:noProof/>
         </w:rPr>
       </w:pPr>
-      <w:hyperlink w:anchor="_Toc243114486" w:history="1">
+      <w:hyperlink w:anchor="_Toc243121293" w:history="1">
         <w:r>
           <w:rPr>
             <w:rStyle w:val="Hyperlink"/>
@@ -631,7 +631,7 @@
             <w:noProof/>
             <w:webHidden/>
           </w:rPr>
-          <w:instrText xml:space="preserve"> PAGEREF _Toc243114486 \h </w:instrText>
+          <w:instrText xml:space="preserve"> PAGEREF _Toc243121293 \h </w:instrText>
         </w:r>
         <w:r>
           <w:rPr>
@@ -672,7 +672,7 @@
           <w:noProof/>
         </w:rPr>
       </w:pPr>
-      <w:hyperlink w:anchor="_Toc243114487" w:history="1">
+      <w:hyperlink w:anchor="_Toc243121294" w:history="1">
         <w:r>
           <w:rPr>
             <w:rStyle w:val="Hyperlink"/>
@@ -699,7 +699,7 @@
             <w:noProof/>
             <w:webHidden/>
           </w:rPr>
-          <w:instrText xml:space="preserve"> PAGEREF _Toc243114487 \h </w:instrText>
+          <w:instrText xml:space="preserve"> PAGEREF _Toc243121294 \h </w:instrText>
         </w:r>
         <w:r>
           <w:rPr>
@@ -740,7 +740,7 @@
           <w:noProof/>
         </w:rPr>
       </w:pPr>
-      <w:hyperlink w:anchor="_Toc243114488" w:history="1">
+      <w:hyperlink w:anchor="_Toc243121295" w:history="1">
         <w:r>
           <w:rPr>
             <w:rStyle w:val="Hyperlink"/>
@@ -767,7 +767,7 @@
             <w:noProof/>
             <w:webHidden/>
           </w:rPr>
-          <w:instrText xml:space="preserve"> PAGEREF _Toc243114488 \h </w:instrText>
+          <w:instrText xml:space="preserve"> PAGEREF _Toc243121295 \h </w:instrText>
         </w:r>
         <w:r>
           <w:rPr>
@@ -808,7 +808,7 @@
           <w:noProof/>
         </w:rPr>
       </w:pPr>
-      <w:hyperlink w:anchor="_Toc243114489" w:history="1">
+      <w:hyperlink w:anchor="_Toc243121296" w:history="1">
         <w:r>
           <w:rPr>
             <w:rStyle w:val="Hyperlink"/>
@@ -835,7 +835,7 @@
             <w:noProof/>
             <w:webHidden/>
           </w:rPr>
-          <w:instrText xml:space="preserve"> PAGEREF _Toc243114489 \h </w:instrText>
+          <w:instrText xml:space="preserve"> PAGEREF _Toc243121296 \h </w:instrText>
         </w:r>
         <w:r>
           <w:rPr>
@@ -876,7 +876,7 @@
           <w:noProof/>
         </w:rPr>
       </w:pPr>
-      <w:hyperlink w:anchor="_Toc243114490" w:history="1">
+      <w:hyperlink w:anchor="_Toc243121297" w:history="1">
         <w:r>
           <w:rPr>
             <w:rStyle w:val="Hyperlink"/>
@@ -903,7 +903,7 @@
             <w:noProof/>
             <w:webHidden/>
           </w:rPr>
-          <w:instrText xml:space="preserve"> PAGEREF _Toc243114490 \h </w:instrText>
+          <w:instrText xml:space="preserve"> PAGEREF _Toc243121297 \h </w:instrText>
         </w:r>
         <w:r>
           <w:rPr>
@@ -944,7 +944,7 @@
           <w:noProof/>
         </w:rPr>
       </w:pPr>
-      <w:hyperlink w:anchor="_Toc243114491" w:history="1">
+      <w:hyperlink w:anchor="_Toc243121298" w:history="1">
         <w:r>
           <w:rPr>
             <w:rStyle w:val="Hyperlink"/>
@@ -971,7 +971,7 @@
             <w:noProof/>
             <w:webHidden/>
           </w:rPr>
-          <w:instrText xml:space="preserve"> PAGEREF _Toc243114491 \h </w:instrText>
+          <w:instrText xml:space="preserve"> PAGEREF _Toc243121298 \h </w:instrText>
         </w:r>
         <w:r>
           <w:rPr>
@@ -1012,7 +1012,7 @@
           <w:noProof/>
         </w:rPr>
       </w:pPr>
-      <w:hyperlink w:anchor="_Toc243114492" w:history="1">
+      <w:hyperlink w:anchor="_Toc243121299" w:history="1">
         <w:r>
           <w:rPr>
             <w:rStyle w:val="Hyperlink"/>
@@ -1039,7 +1039,7 @@
             <w:noProof/>
             <w:webHidden/>
           </w:rPr>
-          <w:instrText xml:space="preserve"> PAGEREF _Toc243114492 \h </w:instrText>
+          <w:instrText xml:space="preserve"> PAGEREF _Toc243121299 \h </w:instrText>
         </w:r>
         <w:r>
           <w:rPr>
@@ -1080,7 +1080,7 @@
           <w:noProof/>
         </w:rPr>
       </w:pPr>
-      <w:hyperlink w:anchor="_Toc243114493" w:history="1">
+      <w:hyperlink w:anchor="_Toc243121300" w:history="1">
         <w:r>
           <w:rPr>
             <w:rStyle w:val="Hyperlink"/>
@@ -1107,7 +1107,7 @@
             <w:noProof/>
             <w:webHidden/>
           </w:rPr>
-          <w:instrText xml:space="preserve"> PAGEREF _Toc243114493 \h </w:instrText>
+          <w:instrText xml:space="preserve"> PAGEREF _Toc243121300 \h </w:instrText>
         </w:r>
         <w:r>
           <w:rPr>
@@ -1148,7 +1148,7 @@
           <w:noProof/>
         </w:rPr>
       </w:pPr>
-      <w:hyperlink w:anchor="_Toc243114494" w:history="1">
+      <w:hyperlink w:anchor="_Toc243121301" w:history="1">
         <w:r>
           <w:rPr>
             <w:rStyle w:val="Hyperlink"/>
@@ -1175,7 +1175,7 @@
             <w:noProof/>
             <w:webHidden/>
           </w:rPr>
-          <w:instrText xml:space="preserve"> PAGEREF _Toc243114494 \h </w:instrText>
+          <w:instrText xml:space="preserve"> PAGEREF _Toc243121301 \h </w:instrText>
         </w:r>
         <w:r>
           <w:rPr>
@@ -1216,7 +1216,7 @@
           <w:noProof/>
         </w:rPr>
       </w:pPr>
-      <w:hyperlink w:anchor="_Toc243114495" w:history="1">
+      <w:hyperlink w:anchor="_Toc243121302" w:history="1">
         <w:r>
           <w:rPr>
             <w:rStyle w:val="Hyperlink"/>
@@ -1243,7 +1243,7 @@
             <w:noProof/>
             <w:webHidden/>
           </w:rPr>
-          <w:instrText xml:space="preserve"> PAGEREF _Toc243114495 \h </w:instrText>
+          <w:instrText xml:space="preserve"> PAGEREF _Toc243121302 \h </w:instrText>
         </w:r>
         <w:r>
           <w:rPr>
@@ -1284,7 +1284,7 @@
           <w:noProof/>
         </w:rPr>
       </w:pPr>
-      <w:hyperlink w:anchor="_Toc243114496" w:history="1">
+      <w:hyperlink w:anchor="_Toc243121303" w:history="1">
         <w:r>
           <w:rPr>
             <w:rStyle w:val="Hyperlink"/>
@@ -1311,7 +1311,7 @@
             <w:noProof/>
             <w:webHidden/>
           </w:rPr>
-          <w:instrText xml:space="preserve"> PAGEREF _Toc243114496 \h </w:instrText>
+          <w:instrText xml:space="preserve"> PAGEREF _Toc243121303 \h </w:instrText>
         </w:r>
         <w:r>
           <w:rPr>
@@ -1352,7 +1352,7 @@
           <w:noProof/>
         </w:rPr>
       </w:pPr>
-      <w:hyperlink w:anchor="_Toc243114497" w:history="1">
+      <w:hyperlink w:anchor="_Toc243121304" w:history="1">
         <w:r>
           <w:rPr>
             <w:rStyle w:val="Hyperlink"/>
@@ -1379,7 +1379,7 @@
             <w:noProof/>
             <w:webHidden/>
           </w:rPr>
-          <w:instrText xml:space="preserve"> PAGEREF _Toc243114497 \h </w:instrText>
+          <w:instrText xml:space="preserve"> PAGEREF _Toc243121304 \h </w:instrText>
         </w:r>
         <w:r>
           <w:rPr>
@@ -1420,7 +1420,7 @@
           <w:noProof/>
         </w:rPr>
       </w:pPr>
-      <w:hyperlink w:anchor="_Toc243114498" w:history="1">
+      <w:hyperlink w:anchor="_Toc243121305" w:history="1">
         <w:r>
           <w:rPr>
             <w:rStyle w:val="Hyperlink"/>
@@ -1447,7 +1447,7 @@
             <w:noProof/>
             <w:webHidden/>
           </w:rPr>
-          <w:instrText xml:space="preserve"> PAGEREF _Toc243114498 \h </w:instrText>
+          <w:instrText xml:space="preserve"> PAGEREF _Toc243121305 \h </w:instrText>
         </w:r>
         <w:r>
           <w:rPr>
@@ -1488,7 +1488,7 @@
           <w:noProof/>
         </w:rPr>
       </w:pPr>
-      <w:hyperlink w:anchor="_Toc243114499" w:history="1">
+      <w:hyperlink w:anchor="_Toc243121306" w:history="1">
         <w:r>
           <w:rPr>
             <w:rStyle w:val="Hyperlink"/>
@@ -1515,7 +1515,7 @@
             <w:noProof/>
             <w:webHidden/>
           </w:rPr>
-          <w:instrText xml:space="preserve"> PAGEREF _Toc243114499 \h </w:instrText>
+          <w:instrText xml:space="preserve"> PAGEREF _Toc243121306 \h </w:instrText>
         </w:r>
         <w:r>
           <w:rPr>
@@ -1556,7 +1556,7 @@
           <w:noProof/>
         </w:rPr>
       </w:pPr>
-      <w:hyperlink w:anchor="_Toc243114500" w:history="1">
+      <w:hyperlink w:anchor="_Toc243121307" w:history="1">
         <w:r>
           <w:rPr>
             <w:rStyle w:val="Hyperlink"/>
@@ -1583,7 +1583,7 @@
             <w:noProof/>
             <w:webHidden/>
           </w:rPr>
-          <w:instrText xml:space="preserve"> PAGEREF _Toc243114500 \h </w:instrText>
+          <w:instrText xml:space="preserve"> PAGEREF _Toc243121307 \h </w:instrText>
         </w:r>
         <w:r>
           <w:rPr>
@@ -1624,7 +1624,7 @@
           <w:noProof/>
         </w:rPr>
       </w:pPr>
-      <w:hyperlink w:anchor="_Toc243114501" w:history="1">
+      <w:hyperlink w:anchor="_Toc243121308" w:history="1">
         <w:r>
           <w:rPr>
             <w:rStyle w:val="Hyperlink"/>
@@ -1651,7 +1651,7 @@
             <w:noProof/>
             <w:webHidden/>
           </w:rPr>
-          <w:instrText xml:space="preserve"> PAGEREF _Toc243114501 \h </w:instrText>
+          <w:instrText xml:space="preserve"> PAGEREF _Toc243121308 \h </w:instrText>
         </w:r>
         <w:r>
           <w:rPr>
@@ -1692,7 +1692,7 @@
           <w:noProof/>
         </w:rPr>
       </w:pPr>
-      <w:hyperlink w:anchor="_Toc243114502" w:history="1">
+      <w:hyperlink w:anchor="_Toc243121309" w:history="1">
         <w:r>
           <w:rPr>
             <w:rStyle w:val="Hyperlink"/>
@@ -1719,7 +1719,7 @@
             <w:noProof/>
             <w:webHidden/>
           </w:rPr>
-          <w:instrText xml:space="preserve"> PAGEREF _Toc243114502 \h </w:instrText>
+          <w:instrText xml:space="preserve"> PAGEREF _Toc243121309 \h </w:instrText>
         </w:r>
         <w:r>
           <w:rPr>
@@ -1760,7 +1760,7 @@
           <w:noProof/>
         </w:rPr>
       </w:pPr>
-      <w:hyperlink w:anchor="_Toc243114503" w:history="1">
+      <w:hyperlink w:anchor="_Toc243121310" w:history="1">
         <w:r>
           <w:rPr>
             <w:rStyle w:val="Hyperlink"/>
@@ -1787,7 +1787,7 @@
             <w:noProof/>
             <w:webHidden/>
           </w:rPr>
-          <w:instrText xml:space="preserve"> PAGEREF _Toc243114503 \h </w:instrText>
+          <w:instrText xml:space="preserve"> PAGEREF _Toc243121310 \h </w:instrText>
         </w:r>
         <w:r>
           <w:rPr>
@@ -1828,7 +1828,7 @@
           <w:noProof/>
         </w:rPr>
       </w:pPr>
-      <w:hyperlink w:anchor="_Toc243114504" w:history="1">
+      <w:hyperlink w:anchor="_Toc243121311" w:history="1">
         <w:r>
           <w:rPr>
             <w:rStyle w:val="Hyperlink"/>
@@ -1855,7 +1855,7 @@
             <w:noProof/>
             <w:webHidden/>
           </w:rPr>
-          <w:instrText xml:space="preserve"> PAGEREF _Toc243114504 \h </w:instrText>
+          <w:instrText xml:space="preserve"> PAGEREF _Toc243121311 \h </w:instrText>
         </w:r>
         <w:r>
           <w:rPr>
@@ -1896,7 +1896,7 @@
           <w:noProof/>
         </w:rPr>
       </w:pPr>
-      <w:hyperlink w:anchor="_Toc243114505" w:history="1">
+      <w:hyperlink w:anchor="_Toc243121312" w:history="1">
         <w:r>
           <w:rPr>
             <w:rStyle w:val="Hyperlink"/>
@@ -1923,7 +1923,7 @@
             <w:noProof/>
             <w:webHidden/>
           </w:rPr>
-          <w:instrText xml:space="preserve"> PAGEREF _Toc243114505 \h </w:instrText>
+          <w:instrText xml:space="preserve"> PAGEREF _Toc243121312 \h </w:instrText>
         </w:r>
         <w:r>
           <w:rPr>
@@ -1964,7 +1964,7 @@
           <w:noProof/>
         </w:rPr>
       </w:pPr>
-      <w:hyperlink w:anchor="_Toc243114506" w:history="1">
+      <w:hyperlink w:anchor="_Toc243121313" w:history="1">
         <w:r>
           <w:rPr>
             <w:rStyle w:val="Hyperlink"/>
@@ -1991,7 +1991,7 @@
             <w:noProof/>
             <w:webHidden/>
           </w:rPr>
-          <w:instrText xml:space="preserve"> PAGEREF _Toc243114506 \h </w:instrText>
+          <w:instrText xml:space="preserve"> PAGEREF _Toc243121313 \h </w:instrText>
         </w:r>
         <w:r>
           <w:rPr>
@@ -2032,7 +2032,7 @@
           <w:noProof/>
         </w:rPr>
       </w:pPr>
-      <w:hyperlink w:anchor="_Toc243114507" w:history="1">
+      <w:hyperlink w:anchor="_Toc243121314" w:history="1">
         <w:r>
           <w:rPr>
             <w:rStyle w:val="Hyperlink"/>
@@ -2059,7 +2059,7 @@
             <w:noProof/>
             <w:webHidden/>
           </w:rPr>
-          <w:instrText xml:space="preserve"> PAGEREF _Toc243114507 \h </w:instrText>
+          <w:instrText xml:space="preserve"> PAGEREF _Toc243121314 \h </w:instrText>
         </w:r>
         <w:r>
           <w:rPr>
@@ -2100,7 +2100,7 @@
           <w:noProof/>
         </w:rPr>
       </w:pPr>
-      <w:hyperlink w:anchor="_Toc243114508" w:history="1">
+      <w:hyperlink w:anchor="_Toc243121315" w:history="1">
         <w:r>
           <w:rPr>
             <w:rStyle w:val="Hyperlink"/>
@@ -2127,7 +2127,7 @@
             <w:noProof/>
             <w:webHidden/>
           </w:rPr>
-          <w:instrText xml:space="preserve"> PAGEREF _Toc243114508 \h </w:instrText>
+          <w:instrText xml:space="preserve"> PAGEREF _Toc243121315 \h </w:instrText>
         </w:r>
         <w:r>
           <w:rPr>
@@ -2168,7 +2168,7 @@
           <w:noProof/>
         </w:rPr>
       </w:pPr>
-      <w:hyperlink w:anchor="_Toc243114509" w:history="1">
+      <w:hyperlink w:anchor="_Toc243121316" w:history="1">
         <w:r>
           <w:rPr>
             <w:rStyle w:val="Hyperlink"/>
@@ -2195,7 +2195,7 @@
             <w:noProof/>
             <w:webHidden/>
           </w:rPr>
-          <w:instrText xml:space="preserve"> PAGEREF _Toc243114509 \h </w:instrText>
+          <w:instrText xml:space="preserve"> PAGEREF _Toc243121316 \h </w:instrText>
         </w:r>
         <w:r>
           <w:rPr>
@@ -2236,7 +2236,7 @@
           <w:noProof/>
         </w:rPr>
       </w:pPr>
-      <w:hyperlink w:anchor="_Toc243114510" w:history="1">
+      <w:hyperlink w:anchor="_Toc243121317" w:history="1">
         <w:r>
           <w:rPr>
             <w:rStyle w:val="Hyperlink"/>
@@ -2263,7 +2263,7 @@
             <w:noProof/>
             <w:webHidden/>
           </w:rPr>
-          <w:instrText xml:space="preserve"> PAGEREF _Toc243114510 \h </w:instrText>
+          <w:instrText xml:space="preserve"> PAGEREF _Toc243121317 \h </w:instrText>
         </w:r>
         <w:r>
           <w:rPr>
@@ -2304,7 +2304,7 @@
           <w:noProof/>
         </w:rPr>
       </w:pPr>
-      <w:hyperlink w:anchor="_Toc243114511" w:history="1">
+      <w:hyperlink w:anchor="_Toc243121318" w:history="1">
         <w:r>
           <w:rPr>
             <w:rStyle w:val="Hyperlink"/>
@@ -2331,7 +2331,7 @@
             <w:noProof/>
             <w:webHidden/>
           </w:rPr>
-          <w:instrText xml:space="preserve"> PAGEREF _Toc243114511 \h </w:instrText>
+          <w:instrText xml:space="preserve"> PAGEREF _Toc243121318 \h </w:instrText>
         </w:r>
         <w:r>
           <w:rPr>
@@ -2372,7 +2372,7 @@
           <w:noProof/>
         </w:rPr>
       </w:pPr>
-      <w:hyperlink w:anchor="_Toc243114512" w:history="1">
+      <w:hyperlink w:anchor="_Toc243121319" w:history="1">
         <w:r>
           <w:rPr>
             <w:rStyle w:val="Hyperlink"/>
@@ -2399,7 +2399,7 @@
             <w:noProof/>
             <w:webHidden/>
           </w:rPr>
-          <w:instrText xml:space="preserve"> PAGEREF _Toc243114512 \h </w:instrText>
+          <w:instrText xml:space="preserve"> PAGEREF _Toc243121319 \h </w:instrText>
         </w:r>
         <w:r>
           <w:rPr>
@@ -2440,7 +2440,7 @@
           <w:noProof/>
         </w:rPr>
       </w:pPr>
-      <w:hyperlink w:anchor="_Toc243114513" w:history="1">
+      <w:hyperlink w:anchor="_Toc243121320" w:history="1">
         <w:r>
           <w:rPr>
             <w:rStyle w:val="Hyperlink"/>
@@ -2467,7 +2467,7 @@
             <w:noProof/>
             <w:webHidden/>
           </w:rPr>
-          <w:instrText xml:space="preserve"> PAGEREF _Toc243114513 \h </w:instrText>
+          <w:instrText xml:space="preserve"> PAGEREF _Toc243121320 \h </w:instrText>
         </w:r>
         <w:r>
           <w:rPr>
@@ -2508,7 +2508,7 @@
           <w:noProof/>
         </w:rPr>
       </w:pPr>
-      <w:hyperlink w:anchor="_Toc243114514" w:history="1">
+      <w:hyperlink w:anchor="_Toc243121321" w:history="1">
         <w:r>
           <w:rPr>
             <w:rStyle w:val="Hyperlink"/>
@@ -2535,7 +2535,7 @@
             <w:noProof/>
             <w:webHidden/>
           </w:rPr>
-          <w:instrText xml:space="preserve"> PAGEREF _Toc243114514 \h </w:instrText>
+          <w:instrText xml:space="preserve"> PAGEREF _Toc243121321 \h </w:instrText>
         </w:r>
         <w:r>
           <w:rPr>
@@ -2574,7 +2574,7 @@
         <w:pStyle w:val="Heading1"/>
         <w:pageBreakBefore/>
       </w:pPr>
-      <w:bookmarkStart w:id="0" w:name="_Toc243114480"/>
+      <w:bookmarkStart w:id="0" w:name="_Toc243121287"/>
       <w:bookmarkStart w:id="1" w:name="introduction"/>
       <w:r>
         <w:lastRenderedPageBreak/>
@@ -2586,7 +2586,7 @@
       <w:pPr>
         <w:pStyle w:val="Heading2"/>
       </w:pPr>
-      <w:bookmarkStart w:id="2" w:name="_Toc243114481"/>
+      <w:bookmarkStart w:id="2" w:name="_Toc243121288"/>
       <w:bookmarkStart w:id="3" w:name="background"/>
       <w:r>
         <w:t>1.1  Background</w:t>
@@ -2605,7 +2605,7 @@
       <w:pPr>
         <w:pStyle w:val="Heading2"/>
       </w:pPr>
-      <w:bookmarkStart w:id="4" w:name="_Toc243114482"/>
+      <w:bookmarkStart w:id="4" w:name="_Toc243121289"/>
       <w:bookmarkStart w:id="5" w:name="problem-statement"/>
       <w:bookmarkEnd w:id="3"/>
       <w:r>
@@ -2687,7 +2687,7 @@
       <w:pPr>
         <w:pStyle w:val="Heading2"/>
       </w:pPr>
-      <w:bookmarkStart w:id="6" w:name="_Toc243114483"/>
+      <w:bookmarkStart w:id="6" w:name="_Toc243121290"/>
       <w:bookmarkStart w:id="7" w:name="objectives"/>
       <w:bookmarkEnd w:id="5"/>
       <w:r>
@@ -2755,7 +2755,7 @@
       <w:pPr>
         <w:pStyle w:val="Heading2"/>
       </w:pPr>
-      <w:bookmarkStart w:id="8" w:name="_Toc243114484"/>
+      <w:bookmarkStart w:id="8" w:name="_Toc243121291"/>
       <w:bookmarkStart w:id="9" w:name="scope-of-the-project"/>
       <w:bookmarkEnd w:id="7"/>
       <w:r>
@@ -2862,7 +2862,7 @@
         <w:pStyle w:val="Heading1"/>
         <w:pageBreakBefore/>
       </w:pPr>
-      <w:bookmarkStart w:id="10" w:name="_Toc243114485"/>
+      <w:bookmarkStart w:id="10" w:name="_Toc243121292"/>
       <w:bookmarkStart w:id="11" w:name="literature-survey"/>
       <w:bookmarkEnd w:id="1"/>
       <w:bookmarkEnd w:id="9"/>
@@ -2876,7 +2876,7 @@
       <w:pPr>
         <w:pStyle w:val="Heading2"/>
       </w:pPr>
-      <w:bookmarkStart w:id="12" w:name="_Toc243114486"/>
+      <w:bookmarkStart w:id="12" w:name="_Toc243121293"/>
       <w:bookmarkStart w:id="13" w:name="comparison-of-existing-research"/>
       <w:r>
         <w:t>2.1  Comparison of Existing Research</w:t>
@@ -3672,7 +3672,7 @@
       <w:pPr>
         <w:pStyle w:val="Heading2"/>
       </w:pPr>
-      <w:bookmarkStart w:id="14" w:name="_Toc243114487"/>
+      <w:bookmarkStart w:id="14" w:name="_Toc243121294"/>
       <w:bookmarkStart w:id="15" w:name="research-gap"/>
       <w:bookmarkEnd w:id="13"/>
       <w:r>
@@ -3694,7 +3694,7 @@
         <w:pStyle w:val="Heading1"/>
         <w:pageBreakBefore/>
       </w:pPr>
-      <w:bookmarkStart w:id="16" w:name="_Toc243114488"/>
+      <w:bookmarkStart w:id="16" w:name="_Toc243121295"/>
       <w:bookmarkStart w:id="17" w:name="methodology"/>
       <w:bookmarkEnd w:id="11"/>
       <w:bookmarkEnd w:id="15"/>
@@ -3708,7 +3708,7 @@
       <w:pPr>
         <w:pStyle w:val="Heading2"/>
       </w:pPr>
-      <w:bookmarkStart w:id="18" w:name="_Toc243114489"/>
+      <w:bookmarkStart w:id="18" w:name="_Toc243121296"/>
       <w:bookmarkStart w:id="19" w:name="proposed-approach"/>
       <w:r>
         <w:t>3.1  Proposed Approach</w:t>
@@ -3727,7 +3727,7 @@
       <w:pPr>
         <w:pStyle w:val="Heading2"/>
       </w:pPr>
-      <w:bookmarkStart w:id="20" w:name="_Toc243114490"/>
+      <w:bookmarkStart w:id="20" w:name="_Toc243121297"/>
       <w:bookmarkStart w:id="21" w:name="dataset-description"/>
       <w:bookmarkEnd w:id="19"/>
       <w:r>
@@ -3935,7 +3935,7 @@
       <w:pPr>
         <w:pStyle w:val="Heading2"/>
       </w:pPr>
-      <w:bookmarkStart w:id="22" w:name="_Toc243114491"/>
+      <w:bookmarkStart w:id="22" w:name="_Toc243121298"/>
       <w:bookmarkStart w:id="23" w:name="algorithms-and-technologies"/>
       <w:bookmarkEnd w:id="21"/>
       <w:r>
@@ -5550,7 +5550,7 @@
       <w:pPr>
         <w:pStyle w:val="Heading2"/>
       </w:pPr>
-      <w:bookmarkStart w:id="24" w:name="_Toc243114492"/>
+      <w:bookmarkStart w:id="24" w:name="_Toc243121299"/>
       <w:bookmarkStart w:id="25" w:name="pos-aware-suggestion-filtering"/>
       <w:bookmarkEnd w:id="23"/>
       <w:r>
@@ -5782,7 +5782,7 @@
       <w:pPr>
         <w:pStyle w:val="Heading2"/>
       </w:pPr>
-      <w:bookmarkStart w:id="26" w:name="_Toc243114493"/>
+      <w:bookmarkStart w:id="26" w:name="_Toc243121300"/>
       <w:bookmarkStart w:id="27" w:name="system-workflow"/>
       <w:bookmarkEnd w:id="25"/>
       <w:r>
@@ -5800,7 +5800,7 @@
           <w:noProof/>
         </w:rPr>
         <w:drawing>
-          <wp:inline distT="0" distB="0" distL="0" distR="0" wp14:anchorId="0ED14B88" wp14:editId="0E4B6232">
+          <wp:inline distT="0" distB="0" distL="0" distR="0" wp14:anchorId="0871DDE9" wp14:editId="135ADBBC">
             <wp:extent cx="5067300" cy="903472"/>
             <wp:effectExtent l="0" t="0" r="0" b="0"/>
             <wp:docPr id="24" name="Picture"/>
@@ -5856,7 +5856,7 @@
         <w:pStyle w:val="Heading1"/>
         <w:pageBreakBefore/>
       </w:pPr>
-      <w:bookmarkStart w:id="28" w:name="_Toc243114494"/>
+      <w:bookmarkStart w:id="28" w:name="_Toc243121301"/>
       <w:bookmarkStart w:id="29" w:name="experimental-details-and-results"/>
       <w:bookmarkEnd w:id="17"/>
       <w:bookmarkEnd w:id="27"/>
@@ -5870,7 +5870,7 @@
       <w:pPr>
         <w:pStyle w:val="Heading2"/>
       </w:pPr>
-      <w:bookmarkStart w:id="30" w:name="_Toc243114495"/>
+      <w:bookmarkStart w:id="30" w:name="_Toc243121302"/>
       <w:bookmarkStart w:id="31" w:name="experimental-environment"/>
       <w:r>
         <w:t>4.1  Experimental Environment</w:t>
@@ -5946,7 +5946,7 @@
         <w:t>Hardware configuration:</w:t>
       </w:r>
       <w:r>
-        <w:t xml:space="preserve"> Standard laptop CPU, no GPU required – all models are simple frequency/probability tables, not neural networks</w:t>
+        <w:t xml:space="preserve"> Standard laptop CPU required – all models are simple frequency/probability tables, not neural networks</w:t>
       </w:r>
     </w:p>
     <w:p>
@@ -5971,7 +5971,7 @@
       <w:pPr>
         <w:pStyle w:val="Heading2"/>
       </w:pPr>
-      <w:bookmarkStart w:id="32" w:name="_Toc243114496"/>
+      <w:bookmarkStart w:id="32" w:name="_Toc243121303"/>
       <w:bookmarkStart w:id="33" w:name="evaluation-metrics"/>
       <w:bookmarkEnd w:id="31"/>
       <w:r>
@@ -6201,7 +6201,7 @@
       <w:pPr>
         <w:pStyle w:val="Heading2"/>
       </w:pPr>
-      <w:bookmarkStart w:id="34" w:name="_Toc243114497"/>
+      <w:bookmarkStart w:id="34" w:name="_Toc243121304"/>
       <w:bookmarkStart w:id="35" w:name="evaluation-set-generation"/>
       <w:bookmarkEnd w:id="33"/>
       <w:r>
@@ -6230,7 +6230,7 @@
       <w:pPr>
         <w:pStyle w:val="Heading2"/>
       </w:pPr>
-      <w:bookmarkStart w:id="36" w:name="_Toc243114498"/>
+      <w:bookmarkStart w:id="36" w:name="_Toc243121305"/>
       <w:bookmarkStart w:id="37" w:name="experimental-results"/>
       <w:bookmarkEnd w:id="35"/>
       <w:r>
@@ -6878,7 +6878,7 @@
       <w:pPr>
         <w:pStyle w:val="Heading2"/>
       </w:pPr>
-      <w:bookmarkStart w:id="38" w:name="_Toc243114499"/>
+      <w:bookmarkStart w:id="38" w:name="_Toc243121306"/>
       <w:bookmarkStart w:id="39" w:name="confusion-matrix"/>
       <w:bookmarkEnd w:id="37"/>
       <w:r>
@@ -6905,7 +6905,7 @@
         </w:rPr>
         <w:lastRenderedPageBreak/>
         <w:drawing>
-          <wp:inline distT="0" distB="0" distL="0" distR="0" wp14:anchorId="7D02DE12" wp14:editId="720E446F">
+          <wp:inline distT="0" distB="0" distL="0" distR="0" wp14:anchorId="1FAC7598" wp14:editId="362807D5">
             <wp:extent cx="4160520" cy="3566160"/>
             <wp:effectExtent l="0" t="0" r="0" b="0"/>
             <wp:docPr id="33" name="Picture"/>
@@ -6968,7 +6968,7 @@
       <w:pPr>
         <w:pStyle w:val="Heading2"/>
       </w:pPr>
-      <w:bookmarkStart w:id="40" w:name="_Toc243114500"/>
+      <w:bookmarkStart w:id="40" w:name="_Toc243121307"/>
       <w:bookmarkStart w:id="41" w:name="output-screenshots"/>
       <w:bookmarkEnd w:id="39"/>
       <w:r>
@@ -6987,7 +6987,7 @@
           <w:noProof/>
         </w:rPr>
         <w:drawing>
-          <wp:inline distT="0" distB="0" distL="0" distR="0" wp14:anchorId="286445BF" wp14:editId="29D467C3">
+          <wp:inline distT="0" distB="0" distL="0" distR="0" wp14:anchorId="38C15863" wp14:editId="6C6897EB">
             <wp:extent cx="4533900" cy="4639339"/>
             <wp:effectExtent l="0" t="0" r="0" b="0"/>
             <wp:docPr id="37" name="Picture"/>
@@ -7076,7 +7076,7 @@
         <w:pStyle w:val="Heading1"/>
         <w:pageBreakBefore/>
       </w:pPr>
-      <w:bookmarkStart w:id="42" w:name="_Toc243114501"/>
+      <w:bookmarkStart w:id="42" w:name="_Toc243121308"/>
       <w:bookmarkStart w:id="43" w:name="error-analysis"/>
       <w:bookmarkEnd w:id="29"/>
       <w:bookmarkEnd w:id="41"/>
@@ -7090,7 +7090,7 @@
       <w:pPr>
         <w:pStyle w:val="Heading2"/>
       </w:pPr>
-      <w:bookmarkStart w:id="44" w:name="_Toc243114502"/>
+      <w:bookmarkStart w:id="44" w:name="_Toc243121309"/>
       <w:bookmarkStart w:id="45" w:name="observed-errors"/>
       <w:r>
         <w:t>5.1  Observed Errors</w:t>
@@ -7656,7 +7656,7 @@
       <w:pPr>
         <w:pStyle w:val="Heading2"/>
       </w:pPr>
-      <w:bookmarkStart w:id="46" w:name="_Toc243114503"/>
+      <w:bookmarkStart w:id="46" w:name="_Toc243121310"/>
       <w:bookmarkStart w:id="47" w:name="possible-causes"/>
       <w:bookmarkEnd w:id="45"/>
       <w:r>
@@ -7894,7 +7894,7 @@
       <w:pPr>
         <w:pStyle w:val="Heading2"/>
       </w:pPr>
-      <w:bookmarkStart w:id="48" w:name="_Toc243114504"/>
+      <w:bookmarkStart w:id="48" w:name="_Toc243121311"/>
       <w:bookmarkStart w:id="49" w:name="improvement-strategies"/>
       <w:bookmarkEnd w:id="47"/>
       <w:r>
@@ -8058,7 +8058,7 @@
         <w:pStyle w:val="Heading1"/>
         <w:pageBreakBefore/>
       </w:pPr>
-      <w:bookmarkStart w:id="50" w:name="_Toc243114505"/>
+      <w:bookmarkStart w:id="50" w:name="_Toc243121312"/>
       <w:bookmarkStart w:id="51" w:name="X8e33f9097ff1185607ebd5024202a1961ff5a9c"/>
       <w:bookmarkEnd w:id="43"/>
       <w:bookmarkEnd w:id="49"/>
@@ -8072,7 +8072,7 @@
       <w:pPr>
         <w:pStyle w:val="Heading2"/>
       </w:pPr>
-      <w:bookmarkStart w:id="52" w:name="_Toc243114506"/>
+      <w:bookmarkStart w:id="52" w:name="_Toc243121313"/>
       <w:bookmarkStart w:id="53" w:name="github-repository"/>
       <w:r>
         <w:t>6.1  GitHub Repository</w:t>
@@ -8125,7 +8125,7 @@
       <w:pPr>
         <w:pStyle w:val="Heading2"/>
       </w:pPr>
-      <w:bookmarkStart w:id="54" w:name="_Toc243114507"/>
+      <w:bookmarkStart w:id="54" w:name="_Toc243121314"/>
       <w:bookmarkStart w:id="55" w:name="deployment-evidence"/>
       <w:bookmarkEnd w:id="53"/>
       <w:r>
@@ -8254,7 +8254,7 @@
       <w:pPr>
         <w:pStyle w:val="Heading2"/>
       </w:pPr>
-      <w:bookmarkStart w:id="56" w:name="_Toc243114508"/>
+      <w:bookmarkStart w:id="56" w:name="_Toc243121315"/>
       <w:bookmarkStart w:id="57" w:name="deployed-application-screenshot"/>
       <w:bookmarkEnd w:id="55"/>
       <w:r>
@@ -8275,7 +8275,7 @@
         <w:pStyle w:val="Heading1"/>
         <w:pageBreakBefore/>
       </w:pPr>
-      <w:bookmarkStart w:id="58" w:name="_Toc243114509"/>
+      <w:bookmarkStart w:id="58" w:name="_Toc243121316"/>
       <w:bookmarkStart w:id="59" w:name="conclusion-and-future-work"/>
       <w:bookmarkEnd w:id="51"/>
       <w:bookmarkEnd w:id="57"/>
@@ -8289,7 +8289,7 @@
       <w:pPr>
         <w:pStyle w:val="Heading2"/>
       </w:pPr>
-      <w:bookmarkStart w:id="60" w:name="_Toc243114510"/>
+      <w:bookmarkStart w:id="60" w:name="_Toc243121317"/>
       <w:bookmarkStart w:id="61" w:name="conclusion"/>
       <w:r>
         <w:t>7.1  Conclusion</w:t>
@@ -8316,7 +8316,7 @@
       <w:pPr>
         <w:pStyle w:val="Heading2"/>
       </w:pPr>
-      <w:bookmarkStart w:id="62" w:name="_Toc243114511"/>
+      <w:bookmarkStart w:id="62" w:name="_Toc243121318"/>
       <w:bookmarkStart w:id="63" w:name="future-work"/>
       <w:bookmarkEnd w:id="61"/>
       <w:r>
@@ -8384,7 +8384,7 @@
         <w:pStyle w:val="Heading1"/>
         <w:pageBreakBefore/>
       </w:pPr>
-      <w:bookmarkStart w:id="64" w:name="_Toc243114512"/>
+      <w:bookmarkStart w:id="64" w:name="_Toc243121319"/>
       <w:bookmarkStart w:id="65" w:name="acknowledgement-of-ai-usage"/>
       <w:bookmarkEnd w:id="59"/>
       <w:bookmarkEnd w:id="63"/>
@@ -8398,7 +8398,7 @@
       <w:pPr>
         <w:pStyle w:val="Heading2"/>
       </w:pPr>
-      <w:bookmarkStart w:id="66" w:name="_Toc243114513"/>
+      <w:bookmarkStart w:id="66" w:name="_Toc243121320"/>
       <w:bookmarkStart w:id="67" w:name="ai-usage-statement"/>
       <w:r>
         <w:t>8.1  AI Usage Statement</w:t>
@@ -8418,7 +8418,7 @@
         <w:pStyle w:val="Heading1"/>
         <w:pageBreakBefore/>
       </w:pPr>
-      <w:bookmarkStart w:id="68" w:name="_Toc243114514"/>
+      <w:bookmarkStart w:id="68" w:name="_Toc243121321"/>
       <w:bookmarkStart w:id="69" w:name="bibliography"/>
       <w:bookmarkEnd w:id="65"/>
       <w:bookmarkEnd w:id="67"/>
@@ -8727,7 +8727,7 @@
   <w:abstractNum w:abstractNumId="0" w15:restartNumberingAfterBreak="0">
     <w:nsid w:val="0000A990"/>
     <w:multiLevelType w:val="multilevel"/>
-    <w:tmpl w:val="723CF56C"/>
+    <w:tmpl w:val="01B6023A"/>
     <w:lvl w:ilvl="0">
       <w:numFmt w:val="bullet"/>
       <w:lvlText w:val=" "/>
@@ -8804,7 +8804,7 @@
   <w:abstractNum w:abstractNumId="1" w15:restartNumberingAfterBreak="0">
     <w:nsid w:val="0000A991"/>
     <w:multiLevelType w:val="multilevel"/>
-    <w:tmpl w:val="A62C9016"/>
+    <w:tmpl w:val="6480EC9A"/>
     <w:lvl w:ilvl="0">
       <w:numFmt w:val="bullet"/>
       <w:lvlText w:val=""/>
@@ -8908,7 +8908,7 @@
   <w:abstractNum w:abstractNumId="2" w15:restartNumberingAfterBreak="0">
     <w:nsid w:val="00A99201"/>
     <w:multiLevelType w:val="multilevel"/>
-    <w:tmpl w:val="2D987164"/>
+    <w:tmpl w:val="7FB60D12"/>
     <w:lvl w:ilvl="0">
       <w:start w:val="1"/>
       <w:numFmt w:val="decimal"/>
@@ -8991,13 +8991,13 @@
       </w:pPr>
     </w:lvl>
   </w:abstractNum>
-  <w:num w:numId="1" w16cid:durableId="1733043572">
+  <w:num w:numId="1" w16cid:durableId="1071198506">
     <w:abstractNumId w:val="0"/>
   </w:num>
-  <w:num w:numId="2" w16cid:durableId="573592051">
+  <w:num w:numId="2" w16cid:durableId="1310666171">
     <w:abstractNumId w:val="1"/>
   </w:num>
-  <w:num w:numId="3" w16cid:durableId="193663943">
+  <w:num w:numId="3" w16cid:durableId="1380662219">
     <w:abstractNumId w:val="2"/>
     <w:lvlOverride w:ilvl="0">
       <w:startOverride w:val="1"/>
@@ -9027,31 +9027,31 @@
       <w:startOverride w:val="1"/>
     </w:lvlOverride>
   </w:num>
-  <w:num w:numId="4" w16cid:durableId="919798085">
+  <w:num w:numId="4" w16cid:durableId="2000309384">
     <w:abstractNumId w:val="1"/>
   </w:num>
-  <w:num w:numId="5" w16cid:durableId="1827085125">
+  <w:num w:numId="5" w16cid:durableId="1681081540">
     <w:abstractNumId w:val="1"/>
   </w:num>
-  <w:num w:numId="6" w16cid:durableId="296489945">
+  <w:num w:numId="6" w16cid:durableId="717051172">
     <w:abstractNumId w:val="1"/>
   </w:num>
-  <w:num w:numId="7" w16cid:durableId="1685865084">
+  <w:num w:numId="7" w16cid:durableId="1507592540">
     <w:abstractNumId w:val="1"/>
   </w:num>
-  <w:num w:numId="8" w16cid:durableId="1722172081">
+  <w:num w:numId="8" w16cid:durableId="745959872">
     <w:abstractNumId w:val="1"/>
   </w:num>
-  <w:num w:numId="9" w16cid:durableId="1439790545">
+  <w:num w:numId="9" w16cid:durableId="14423707">
     <w:abstractNumId w:val="1"/>
   </w:num>
-  <w:num w:numId="10" w16cid:durableId="537091194">
+  <w:num w:numId="10" w16cid:durableId="953706538">
     <w:abstractNumId w:val="1"/>
   </w:num>
-  <w:num w:numId="11" w16cid:durableId="167596230">
+  <w:num w:numId="11" w16cid:durableId="1434671665">
     <w:abstractNumId w:val="1"/>
   </w:num>
-  <w:num w:numId="12" w16cid:durableId="1320309450">
+  <w:num w:numId="12" w16cid:durableId="801311532">
     <w:abstractNumId w:val="2"/>
     <w:lvlOverride w:ilvl="0">
       <w:startOverride w:val="1"/>
@@ -9081,7 +9081,7 @@
       <w:startOverride w:val="1"/>
     </w:lvlOverride>
   </w:num>
-  <w:num w:numId="13" w16cid:durableId="2123719644">
+  <w:num w:numId="13" w16cid:durableId="1649897216">
     <w:abstractNumId w:val="1"/>
   </w:num>
 </w:numbering>
@@ -10333,7 +10333,7 @@
     <w:name w:val="header"/>
     <w:basedOn w:val="Normal"/>
     <w:link w:val="HeaderChar"/>
-    <w:rsid w:val="008D24C0"/>
+    <w:rsid w:val="00F3549B"/>
     <w:pPr>
       <w:tabs>
         <w:tab w:val="center" w:pos="4513"/>
@@ -10346,7 +10346,7 @@
     <w:name w:val="Header Char"/>
     <w:basedOn w:val="DefaultParagraphFont"/>
     <w:link w:val="Header"/>
-    <w:rsid w:val="008D24C0"/>
+    <w:rsid w:val="00F3549B"/>
     <w:rPr>
       <w:rFonts w:ascii="Cambria" w:eastAsia="Cambria" w:hAnsi="Cambria"/>
     </w:rPr>
@@ -10355,7 +10355,7 @@
     <w:name w:val="footer"/>
     <w:basedOn w:val="Normal"/>
     <w:link w:val="FooterChar"/>
-    <w:rsid w:val="008D24C0"/>
+    <w:rsid w:val="00F3549B"/>
     <w:pPr>
       <w:tabs>
         <w:tab w:val="center" w:pos="4513"/>
@@ -10368,7 +10368,7 @@
     <w:name w:val="Footer Char"/>
     <w:basedOn w:val="DefaultParagraphFont"/>
     <w:link w:val="Footer"/>
-    <w:rsid w:val="008D24C0"/>
+    <w:rsid w:val="00F3549B"/>
     <w:rPr>
       <w:rFonts w:ascii="Cambria" w:eastAsia="Cambria" w:hAnsi="Cambria"/>
     </w:rPr>
@@ -10379,7 +10379,7 @@
     <w:next w:val="Normal"/>
     <w:autoRedefine/>
     <w:uiPriority w:val="39"/>
-    <w:rsid w:val="008D24C0"/>
+    <w:rsid w:val="00F3549B"/>
     <w:pPr>
       <w:spacing w:after="100"/>
     </w:pPr>
@@ -10390,7 +10390,7 @@
     <w:next w:val="Normal"/>
     <w:autoRedefine/>
     <w:uiPriority w:val="39"/>
-    <w:rsid w:val="008D24C0"/>
+    <w:rsid w:val="00F3549B"/>
     <w:pPr>
       <w:spacing w:after="100"/>
       <w:ind w:left="240"/>

</xml_diff>

<commit_message>
Correct POS confusion explanation on slide 8 and in report (noun/adjective words and unseen names, not 'that')
</commit_message>
<xml_diff>
--- a/report/main.docx
+++ b/report/main.docx
@@ -196,7 +196,7 @@
       <w:r>
         <w:fldChar w:fldCharType="separate"/>
       </w:r>
-      <w:hyperlink w:anchor="_Toc243121287" w:history="1">
+      <w:hyperlink w:anchor="_Toc243124174" w:history="1">
         <w:r>
           <w:rPr>
             <w:rStyle w:val="Hyperlink"/>
@@ -223,7 +223,7 @@
             <w:noProof/>
             <w:webHidden/>
           </w:rPr>
-          <w:instrText xml:space="preserve"> PAGEREF _Toc243121287 \h </w:instrText>
+          <w:instrText xml:space="preserve"> PAGEREF _Toc243124174 \h </w:instrText>
         </w:r>
         <w:r>
           <w:rPr>
@@ -264,7 +264,7 @@
           <w:noProof/>
         </w:rPr>
       </w:pPr>
-      <w:hyperlink w:anchor="_Toc243121288" w:history="1">
+      <w:hyperlink w:anchor="_Toc243124175" w:history="1">
         <w:r>
           <w:rPr>
             <w:rStyle w:val="Hyperlink"/>
@@ -291,7 +291,7 @@
             <w:noProof/>
             <w:webHidden/>
           </w:rPr>
-          <w:instrText xml:space="preserve"> PAGEREF _Toc243121288 \h </w:instrText>
+          <w:instrText xml:space="preserve"> PAGEREF _Toc243124175 \h </w:instrText>
         </w:r>
         <w:r>
           <w:rPr>
@@ -332,7 +332,7 @@
           <w:noProof/>
         </w:rPr>
       </w:pPr>
-      <w:hyperlink w:anchor="_Toc243121289" w:history="1">
+      <w:hyperlink w:anchor="_Toc243124176" w:history="1">
         <w:r>
           <w:rPr>
             <w:rStyle w:val="Hyperlink"/>
@@ -359,7 +359,7 @@
             <w:noProof/>
             <w:webHidden/>
           </w:rPr>
-          <w:instrText xml:space="preserve"> PAGEREF _Toc243121289 \h </w:instrText>
+          <w:instrText xml:space="preserve"> PAGEREF _Toc243124176 \h </w:instrText>
         </w:r>
         <w:r>
           <w:rPr>
@@ -400,7 +400,7 @@
           <w:noProof/>
         </w:rPr>
       </w:pPr>
-      <w:hyperlink w:anchor="_Toc243121290" w:history="1">
+      <w:hyperlink w:anchor="_Toc243124177" w:history="1">
         <w:r>
           <w:rPr>
             <w:rStyle w:val="Hyperlink"/>
@@ -427,7 +427,7 @@
             <w:noProof/>
             <w:webHidden/>
           </w:rPr>
-          <w:instrText xml:space="preserve"> PAGEREF _Toc243121290 \h </w:instrText>
+          <w:instrText xml:space="preserve"> PAGEREF _Toc243124177 \h </w:instrText>
         </w:r>
         <w:r>
           <w:rPr>
@@ -468,7 +468,7 @@
           <w:noProof/>
         </w:rPr>
       </w:pPr>
-      <w:hyperlink w:anchor="_Toc243121291" w:history="1">
+      <w:hyperlink w:anchor="_Toc243124178" w:history="1">
         <w:r>
           <w:rPr>
             <w:rStyle w:val="Hyperlink"/>
@@ -495,7 +495,7 @@
             <w:noProof/>
             <w:webHidden/>
           </w:rPr>
-          <w:instrText xml:space="preserve"> PAGEREF _Toc243121291 \h </w:instrText>
+          <w:instrText xml:space="preserve"> PAGEREF _Toc243124178 \h </w:instrText>
         </w:r>
         <w:r>
           <w:rPr>
@@ -536,7 +536,7 @@
           <w:noProof/>
         </w:rPr>
       </w:pPr>
-      <w:hyperlink w:anchor="_Toc243121292" w:history="1">
+      <w:hyperlink w:anchor="_Toc243124179" w:history="1">
         <w:r>
           <w:rPr>
             <w:rStyle w:val="Hyperlink"/>
@@ -563,7 +563,7 @@
             <w:noProof/>
             <w:webHidden/>
           </w:rPr>
-          <w:instrText xml:space="preserve"> PAGEREF _Toc243121292 \h </w:instrText>
+          <w:instrText xml:space="preserve"> PAGEREF _Toc243124179 \h </w:instrText>
         </w:r>
         <w:r>
           <w:rPr>
@@ -604,7 +604,7 @@
           <w:noProof/>
         </w:rPr>
       </w:pPr>
-      <w:hyperlink w:anchor="_Toc243121293" w:history="1">
+      <w:hyperlink w:anchor="_Toc243124180" w:history="1">
         <w:r>
           <w:rPr>
             <w:rStyle w:val="Hyperlink"/>
@@ -631,7 +631,7 @@
             <w:noProof/>
             <w:webHidden/>
           </w:rPr>
-          <w:instrText xml:space="preserve"> PAGEREF _Toc243121293 \h </w:instrText>
+          <w:instrText xml:space="preserve"> PAGEREF _Toc243124180 \h </w:instrText>
         </w:r>
         <w:r>
           <w:rPr>
@@ -672,7 +672,7 @@
           <w:noProof/>
         </w:rPr>
       </w:pPr>
-      <w:hyperlink w:anchor="_Toc243121294" w:history="1">
+      <w:hyperlink w:anchor="_Toc243124181" w:history="1">
         <w:r>
           <w:rPr>
             <w:rStyle w:val="Hyperlink"/>
@@ -699,7 +699,7 @@
             <w:noProof/>
             <w:webHidden/>
           </w:rPr>
-          <w:instrText xml:space="preserve"> PAGEREF _Toc243121294 \h </w:instrText>
+          <w:instrText xml:space="preserve"> PAGEREF _Toc243124181 \h </w:instrText>
         </w:r>
         <w:r>
           <w:rPr>
@@ -740,7 +740,7 @@
           <w:noProof/>
         </w:rPr>
       </w:pPr>
-      <w:hyperlink w:anchor="_Toc243121295" w:history="1">
+      <w:hyperlink w:anchor="_Toc243124182" w:history="1">
         <w:r>
           <w:rPr>
             <w:rStyle w:val="Hyperlink"/>
@@ -767,7 +767,7 @@
             <w:noProof/>
             <w:webHidden/>
           </w:rPr>
-          <w:instrText xml:space="preserve"> PAGEREF _Toc243121295 \h </w:instrText>
+          <w:instrText xml:space="preserve"> PAGEREF _Toc243124182 \h </w:instrText>
         </w:r>
         <w:r>
           <w:rPr>
@@ -808,7 +808,7 @@
           <w:noProof/>
         </w:rPr>
       </w:pPr>
-      <w:hyperlink w:anchor="_Toc243121296" w:history="1">
+      <w:hyperlink w:anchor="_Toc243124183" w:history="1">
         <w:r>
           <w:rPr>
             <w:rStyle w:val="Hyperlink"/>
@@ -835,7 +835,7 @@
             <w:noProof/>
             <w:webHidden/>
           </w:rPr>
-          <w:instrText xml:space="preserve"> PAGEREF _Toc243121296 \h </w:instrText>
+          <w:instrText xml:space="preserve"> PAGEREF _Toc243124183 \h </w:instrText>
         </w:r>
         <w:r>
           <w:rPr>
@@ -876,7 +876,7 @@
           <w:noProof/>
         </w:rPr>
       </w:pPr>
-      <w:hyperlink w:anchor="_Toc243121297" w:history="1">
+      <w:hyperlink w:anchor="_Toc243124184" w:history="1">
         <w:r>
           <w:rPr>
             <w:rStyle w:val="Hyperlink"/>
@@ -903,7 +903,7 @@
             <w:noProof/>
             <w:webHidden/>
           </w:rPr>
-          <w:instrText xml:space="preserve"> PAGEREF _Toc243121297 \h </w:instrText>
+          <w:instrText xml:space="preserve"> PAGEREF _Toc243124184 \h </w:instrText>
         </w:r>
         <w:r>
           <w:rPr>
@@ -944,7 +944,7 @@
           <w:noProof/>
         </w:rPr>
       </w:pPr>
-      <w:hyperlink w:anchor="_Toc243121298" w:history="1">
+      <w:hyperlink w:anchor="_Toc243124185" w:history="1">
         <w:r>
           <w:rPr>
             <w:rStyle w:val="Hyperlink"/>
@@ -971,7 +971,7 @@
             <w:noProof/>
             <w:webHidden/>
           </w:rPr>
-          <w:instrText xml:space="preserve"> PAGEREF _Toc243121298 \h </w:instrText>
+          <w:instrText xml:space="preserve"> PAGEREF _Toc243124185 \h </w:instrText>
         </w:r>
         <w:r>
           <w:rPr>
@@ -1012,7 +1012,7 @@
           <w:noProof/>
         </w:rPr>
       </w:pPr>
-      <w:hyperlink w:anchor="_Toc243121299" w:history="1">
+      <w:hyperlink w:anchor="_Toc243124186" w:history="1">
         <w:r>
           <w:rPr>
             <w:rStyle w:val="Hyperlink"/>
@@ -1039,7 +1039,7 @@
             <w:noProof/>
             <w:webHidden/>
           </w:rPr>
-          <w:instrText xml:space="preserve"> PAGEREF _Toc243121299 \h </w:instrText>
+          <w:instrText xml:space="preserve"> PAGEREF _Toc243124186 \h </w:instrText>
         </w:r>
         <w:r>
           <w:rPr>
@@ -1080,7 +1080,7 @@
           <w:noProof/>
         </w:rPr>
       </w:pPr>
-      <w:hyperlink w:anchor="_Toc243121300" w:history="1">
+      <w:hyperlink w:anchor="_Toc243124187" w:history="1">
         <w:r>
           <w:rPr>
             <w:rStyle w:val="Hyperlink"/>
@@ -1107,7 +1107,7 @@
             <w:noProof/>
             <w:webHidden/>
           </w:rPr>
-          <w:instrText xml:space="preserve"> PAGEREF _Toc243121300 \h </w:instrText>
+          <w:instrText xml:space="preserve"> PAGEREF _Toc243124187 \h </w:instrText>
         </w:r>
         <w:r>
           <w:rPr>
@@ -1148,7 +1148,7 @@
           <w:noProof/>
         </w:rPr>
       </w:pPr>
-      <w:hyperlink w:anchor="_Toc243121301" w:history="1">
+      <w:hyperlink w:anchor="_Toc243124188" w:history="1">
         <w:r>
           <w:rPr>
             <w:rStyle w:val="Hyperlink"/>
@@ -1175,7 +1175,7 @@
             <w:noProof/>
             <w:webHidden/>
           </w:rPr>
-          <w:instrText xml:space="preserve"> PAGEREF _Toc243121301 \h </w:instrText>
+          <w:instrText xml:space="preserve"> PAGEREF _Toc243124188 \h </w:instrText>
         </w:r>
         <w:r>
           <w:rPr>
@@ -1216,7 +1216,7 @@
           <w:noProof/>
         </w:rPr>
       </w:pPr>
-      <w:hyperlink w:anchor="_Toc243121302" w:history="1">
+      <w:hyperlink w:anchor="_Toc243124189" w:history="1">
         <w:r>
           <w:rPr>
             <w:rStyle w:val="Hyperlink"/>
@@ -1243,7 +1243,7 @@
             <w:noProof/>
             <w:webHidden/>
           </w:rPr>
-          <w:instrText xml:space="preserve"> PAGEREF _Toc243121302 \h </w:instrText>
+          <w:instrText xml:space="preserve"> PAGEREF _Toc243124189 \h </w:instrText>
         </w:r>
         <w:r>
           <w:rPr>
@@ -1284,7 +1284,7 @@
           <w:noProof/>
         </w:rPr>
       </w:pPr>
-      <w:hyperlink w:anchor="_Toc243121303" w:history="1">
+      <w:hyperlink w:anchor="_Toc243124190" w:history="1">
         <w:r>
           <w:rPr>
             <w:rStyle w:val="Hyperlink"/>
@@ -1311,7 +1311,7 @@
             <w:noProof/>
             <w:webHidden/>
           </w:rPr>
-          <w:instrText xml:space="preserve"> PAGEREF _Toc243121303 \h </w:instrText>
+          <w:instrText xml:space="preserve"> PAGEREF _Toc243124190 \h </w:instrText>
         </w:r>
         <w:r>
           <w:rPr>
@@ -1352,7 +1352,7 @@
           <w:noProof/>
         </w:rPr>
       </w:pPr>
-      <w:hyperlink w:anchor="_Toc243121304" w:history="1">
+      <w:hyperlink w:anchor="_Toc243124191" w:history="1">
         <w:r>
           <w:rPr>
             <w:rStyle w:val="Hyperlink"/>
@@ -1379,7 +1379,7 @@
             <w:noProof/>
             <w:webHidden/>
           </w:rPr>
-          <w:instrText xml:space="preserve"> PAGEREF _Toc243121304 \h </w:instrText>
+          <w:instrText xml:space="preserve"> PAGEREF _Toc243124191 \h </w:instrText>
         </w:r>
         <w:r>
           <w:rPr>
@@ -1420,7 +1420,7 @@
           <w:noProof/>
         </w:rPr>
       </w:pPr>
-      <w:hyperlink w:anchor="_Toc243121305" w:history="1">
+      <w:hyperlink w:anchor="_Toc243124192" w:history="1">
         <w:r>
           <w:rPr>
             <w:rStyle w:val="Hyperlink"/>
@@ -1447,7 +1447,7 @@
             <w:noProof/>
             <w:webHidden/>
           </w:rPr>
-          <w:instrText xml:space="preserve"> PAGEREF _Toc243121305 \h </w:instrText>
+          <w:instrText xml:space="preserve"> PAGEREF _Toc243124192 \h </w:instrText>
         </w:r>
         <w:r>
           <w:rPr>
@@ -1488,7 +1488,7 @@
           <w:noProof/>
         </w:rPr>
       </w:pPr>
-      <w:hyperlink w:anchor="_Toc243121306" w:history="1">
+      <w:hyperlink w:anchor="_Toc243124193" w:history="1">
         <w:r>
           <w:rPr>
             <w:rStyle w:val="Hyperlink"/>
@@ -1515,7 +1515,7 @@
             <w:noProof/>
             <w:webHidden/>
           </w:rPr>
-          <w:instrText xml:space="preserve"> PAGEREF _Toc243121306 \h </w:instrText>
+          <w:instrText xml:space="preserve"> PAGEREF _Toc243124193 \h </w:instrText>
         </w:r>
         <w:r>
           <w:rPr>
@@ -1556,7 +1556,7 @@
           <w:noProof/>
         </w:rPr>
       </w:pPr>
-      <w:hyperlink w:anchor="_Toc243121307" w:history="1">
+      <w:hyperlink w:anchor="_Toc243124194" w:history="1">
         <w:r>
           <w:rPr>
             <w:rStyle w:val="Hyperlink"/>
@@ -1583,7 +1583,7 @@
             <w:noProof/>
             <w:webHidden/>
           </w:rPr>
-          <w:instrText xml:space="preserve"> PAGEREF _Toc243121307 \h </w:instrText>
+          <w:instrText xml:space="preserve"> PAGEREF _Toc243124194 \h </w:instrText>
         </w:r>
         <w:r>
           <w:rPr>
@@ -1624,7 +1624,7 @@
           <w:noProof/>
         </w:rPr>
       </w:pPr>
-      <w:hyperlink w:anchor="_Toc243121308" w:history="1">
+      <w:hyperlink w:anchor="_Toc243124195" w:history="1">
         <w:r>
           <w:rPr>
             <w:rStyle w:val="Hyperlink"/>
@@ -1651,7 +1651,7 @@
             <w:noProof/>
             <w:webHidden/>
           </w:rPr>
-          <w:instrText xml:space="preserve"> PAGEREF _Toc243121308 \h </w:instrText>
+          <w:instrText xml:space="preserve"> PAGEREF _Toc243124195 \h </w:instrText>
         </w:r>
         <w:r>
           <w:rPr>
@@ -1692,7 +1692,7 @@
           <w:noProof/>
         </w:rPr>
       </w:pPr>
-      <w:hyperlink w:anchor="_Toc243121309" w:history="1">
+      <w:hyperlink w:anchor="_Toc243124196" w:history="1">
         <w:r>
           <w:rPr>
             <w:rStyle w:val="Hyperlink"/>
@@ -1719,7 +1719,7 @@
             <w:noProof/>
             <w:webHidden/>
           </w:rPr>
-          <w:instrText xml:space="preserve"> PAGEREF _Toc243121309 \h </w:instrText>
+          <w:instrText xml:space="preserve"> PAGEREF _Toc243124196 \h </w:instrText>
         </w:r>
         <w:r>
           <w:rPr>
@@ -1760,7 +1760,7 @@
           <w:noProof/>
         </w:rPr>
       </w:pPr>
-      <w:hyperlink w:anchor="_Toc243121310" w:history="1">
+      <w:hyperlink w:anchor="_Toc243124197" w:history="1">
         <w:r>
           <w:rPr>
             <w:rStyle w:val="Hyperlink"/>
@@ -1787,7 +1787,7 @@
             <w:noProof/>
             <w:webHidden/>
           </w:rPr>
-          <w:instrText xml:space="preserve"> PAGEREF _Toc243121310 \h </w:instrText>
+          <w:instrText xml:space="preserve"> PAGEREF _Toc243124197 \h </w:instrText>
         </w:r>
         <w:r>
           <w:rPr>
@@ -1828,7 +1828,7 @@
           <w:noProof/>
         </w:rPr>
       </w:pPr>
-      <w:hyperlink w:anchor="_Toc243121311" w:history="1">
+      <w:hyperlink w:anchor="_Toc243124198" w:history="1">
         <w:r>
           <w:rPr>
             <w:rStyle w:val="Hyperlink"/>
@@ -1855,7 +1855,7 @@
             <w:noProof/>
             <w:webHidden/>
           </w:rPr>
-          <w:instrText xml:space="preserve"> PAGEREF _Toc243121311 \h </w:instrText>
+          <w:instrText xml:space="preserve"> PAGEREF _Toc243124198 \h </w:instrText>
         </w:r>
         <w:r>
           <w:rPr>
@@ -1896,7 +1896,7 @@
           <w:noProof/>
         </w:rPr>
       </w:pPr>
-      <w:hyperlink w:anchor="_Toc243121312" w:history="1">
+      <w:hyperlink w:anchor="_Toc243124199" w:history="1">
         <w:r>
           <w:rPr>
             <w:rStyle w:val="Hyperlink"/>
@@ -1923,7 +1923,7 @@
             <w:noProof/>
             <w:webHidden/>
           </w:rPr>
-          <w:instrText xml:space="preserve"> PAGEREF _Toc243121312 \h </w:instrText>
+          <w:instrText xml:space="preserve"> PAGEREF _Toc243124199 \h </w:instrText>
         </w:r>
         <w:r>
           <w:rPr>
@@ -1964,7 +1964,7 @@
           <w:noProof/>
         </w:rPr>
       </w:pPr>
-      <w:hyperlink w:anchor="_Toc243121313" w:history="1">
+      <w:hyperlink w:anchor="_Toc243124200" w:history="1">
         <w:r>
           <w:rPr>
             <w:rStyle w:val="Hyperlink"/>
@@ -1991,7 +1991,7 @@
             <w:noProof/>
             <w:webHidden/>
           </w:rPr>
-          <w:instrText xml:space="preserve"> PAGEREF _Toc243121313 \h </w:instrText>
+          <w:instrText xml:space="preserve"> PAGEREF _Toc243124200 \h </w:instrText>
         </w:r>
         <w:r>
           <w:rPr>
@@ -2032,7 +2032,7 @@
           <w:noProof/>
         </w:rPr>
       </w:pPr>
-      <w:hyperlink w:anchor="_Toc243121314" w:history="1">
+      <w:hyperlink w:anchor="_Toc243124201" w:history="1">
         <w:r>
           <w:rPr>
             <w:rStyle w:val="Hyperlink"/>
@@ -2059,7 +2059,7 @@
             <w:noProof/>
             <w:webHidden/>
           </w:rPr>
-          <w:instrText xml:space="preserve"> PAGEREF _Toc243121314 \h </w:instrText>
+          <w:instrText xml:space="preserve"> PAGEREF _Toc243124201 \h </w:instrText>
         </w:r>
         <w:r>
           <w:rPr>
@@ -2100,7 +2100,7 @@
           <w:noProof/>
         </w:rPr>
       </w:pPr>
-      <w:hyperlink w:anchor="_Toc243121315" w:history="1">
+      <w:hyperlink w:anchor="_Toc243124202" w:history="1">
         <w:r>
           <w:rPr>
             <w:rStyle w:val="Hyperlink"/>
@@ -2127,7 +2127,7 @@
             <w:noProof/>
             <w:webHidden/>
           </w:rPr>
-          <w:instrText xml:space="preserve"> PAGEREF _Toc243121315 \h </w:instrText>
+          <w:instrText xml:space="preserve"> PAGEREF _Toc243124202 \h </w:instrText>
         </w:r>
         <w:r>
           <w:rPr>
@@ -2168,7 +2168,7 @@
           <w:noProof/>
         </w:rPr>
       </w:pPr>
-      <w:hyperlink w:anchor="_Toc243121316" w:history="1">
+      <w:hyperlink w:anchor="_Toc243124203" w:history="1">
         <w:r>
           <w:rPr>
             <w:rStyle w:val="Hyperlink"/>
@@ -2195,7 +2195,7 @@
             <w:noProof/>
             <w:webHidden/>
           </w:rPr>
-          <w:instrText xml:space="preserve"> PAGEREF _Toc243121316 \h </w:instrText>
+          <w:instrText xml:space="preserve"> PAGEREF _Toc243124203 \h </w:instrText>
         </w:r>
         <w:r>
           <w:rPr>
@@ -2236,7 +2236,7 @@
           <w:noProof/>
         </w:rPr>
       </w:pPr>
-      <w:hyperlink w:anchor="_Toc243121317" w:history="1">
+      <w:hyperlink w:anchor="_Toc243124204" w:history="1">
         <w:r>
           <w:rPr>
             <w:rStyle w:val="Hyperlink"/>
@@ -2263,7 +2263,7 @@
             <w:noProof/>
             <w:webHidden/>
           </w:rPr>
-          <w:instrText xml:space="preserve"> PAGEREF _Toc243121317 \h </w:instrText>
+          <w:instrText xml:space="preserve"> PAGEREF _Toc243124204 \h </w:instrText>
         </w:r>
         <w:r>
           <w:rPr>
@@ -2304,7 +2304,7 @@
           <w:noProof/>
         </w:rPr>
       </w:pPr>
-      <w:hyperlink w:anchor="_Toc243121318" w:history="1">
+      <w:hyperlink w:anchor="_Toc243124205" w:history="1">
         <w:r>
           <w:rPr>
             <w:rStyle w:val="Hyperlink"/>
@@ -2331,7 +2331,7 @@
             <w:noProof/>
             <w:webHidden/>
           </w:rPr>
-          <w:instrText xml:space="preserve"> PAGEREF _Toc243121318 \h </w:instrText>
+          <w:instrText xml:space="preserve"> PAGEREF _Toc243124205 \h </w:instrText>
         </w:r>
         <w:r>
           <w:rPr>
@@ -2372,7 +2372,7 @@
           <w:noProof/>
         </w:rPr>
       </w:pPr>
-      <w:hyperlink w:anchor="_Toc243121319" w:history="1">
+      <w:hyperlink w:anchor="_Toc243124206" w:history="1">
         <w:r>
           <w:rPr>
             <w:rStyle w:val="Hyperlink"/>
@@ -2399,7 +2399,7 @@
             <w:noProof/>
             <w:webHidden/>
           </w:rPr>
-          <w:instrText xml:space="preserve"> PAGEREF _Toc243121319 \h </w:instrText>
+          <w:instrText xml:space="preserve"> PAGEREF _Toc243124206 \h </w:instrText>
         </w:r>
         <w:r>
           <w:rPr>
@@ -2440,7 +2440,7 @@
           <w:noProof/>
         </w:rPr>
       </w:pPr>
-      <w:hyperlink w:anchor="_Toc243121320" w:history="1">
+      <w:hyperlink w:anchor="_Toc243124207" w:history="1">
         <w:r>
           <w:rPr>
             <w:rStyle w:val="Hyperlink"/>
@@ -2467,7 +2467,7 @@
             <w:noProof/>
             <w:webHidden/>
           </w:rPr>
-          <w:instrText xml:space="preserve"> PAGEREF _Toc243121320 \h </w:instrText>
+          <w:instrText xml:space="preserve"> PAGEREF _Toc243124207 \h </w:instrText>
         </w:r>
         <w:r>
           <w:rPr>
@@ -2508,7 +2508,7 @@
           <w:noProof/>
         </w:rPr>
       </w:pPr>
-      <w:hyperlink w:anchor="_Toc243121321" w:history="1">
+      <w:hyperlink w:anchor="_Toc243124208" w:history="1">
         <w:r>
           <w:rPr>
             <w:rStyle w:val="Hyperlink"/>
@@ -2535,7 +2535,7 @@
             <w:noProof/>
             <w:webHidden/>
           </w:rPr>
-          <w:instrText xml:space="preserve"> PAGEREF _Toc243121321 \h </w:instrText>
+          <w:instrText xml:space="preserve"> PAGEREF _Toc243124208 \h </w:instrText>
         </w:r>
         <w:r>
           <w:rPr>
@@ -2574,7 +2574,7 @@
         <w:pStyle w:val="Heading1"/>
         <w:pageBreakBefore/>
       </w:pPr>
-      <w:bookmarkStart w:id="0" w:name="_Toc243121287"/>
+      <w:bookmarkStart w:id="0" w:name="_Toc243124174"/>
       <w:bookmarkStart w:id="1" w:name="introduction"/>
       <w:r>
         <w:lastRenderedPageBreak/>
@@ -2586,7 +2586,7 @@
       <w:pPr>
         <w:pStyle w:val="Heading2"/>
       </w:pPr>
-      <w:bookmarkStart w:id="2" w:name="_Toc243121288"/>
+      <w:bookmarkStart w:id="2" w:name="_Toc243124175"/>
       <w:bookmarkStart w:id="3" w:name="background"/>
       <w:r>
         <w:t>1.1  Background</w:t>
@@ -2605,7 +2605,7 @@
       <w:pPr>
         <w:pStyle w:val="Heading2"/>
       </w:pPr>
-      <w:bookmarkStart w:id="4" w:name="_Toc243121289"/>
+      <w:bookmarkStart w:id="4" w:name="_Toc243124176"/>
       <w:bookmarkStart w:id="5" w:name="problem-statement"/>
       <w:bookmarkEnd w:id="3"/>
       <w:r>
@@ -2687,7 +2687,7 @@
       <w:pPr>
         <w:pStyle w:val="Heading2"/>
       </w:pPr>
-      <w:bookmarkStart w:id="6" w:name="_Toc243121290"/>
+      <w:bookmarkStart w:id="6" w:name="_Toc243124177"/>
       <w:bookmarkStart w:id="7" w:name="objectives"/>
       <w:bookmarkEnd w:id="5"/>
       <w:r>
@@ -2755,7 +2755,7 @@
       <w:pPr>
         <w:pStyle w:val="Heading2"/>
       </w:pPr>
-      <w:bookmarkStart w:id="8" w:name="_Toc243121291"/>
+      <w:bookmarkStart w:id="8" w:name="_Toc243124178"/>
       <w:bookmarkStart w:id="9" w:name="scope-of-the-project"/>
       <w:bookmarkEnd w:id="7"/>
       <w:r>
@@ -2862,7 +2862,7 @@
         <w:pStyle w:val="Heading1"/>
         <w:pageBreakBefore/>
       </w:pPr>
-      <w:bookmarkStart w:id="10" w:name="_Toc243121292"/>
+      <w:bookmarkStart w:id="10" w:name="_Toc243124179"/>
       <w:bookmarkStart w:id="11" w:name="literature-survey"/>
       <w:bookmarkEnd w:id="1"/>
       <w:bookmarkEnd w:id="9"/>
@@ -2876,7 +2876,7 @@
       <w:pPr>
         <w:pStyle w:val="Heading2"/>
       </w:pPr>
-      <w:bookmarkStart w:id="12" w:name="_Toc243121293"/>
+      <w:bookmarkStart w:id="12" w:name="_Toc243124180"/>
       <w:bookmarkStart w:id="13" w:name="comparison-of-existing-research"/>
       <w:r>
         <w:t>2.1  Comparison of Existing Research</w:t>
@@ -3672,7 +3672,7 @@
       <w:pPr>
         <w:pStyle w:val="Heading2"/>
       </w:pPr>
-      <w:bookmarkStart w:id="14" w:name="_Toc243121294"/>
+      <w:bookmarkStart w:id="14" w:name="_Toc243124181"/>
       <w:bookmarkStart w:id="15" w:name="research-gap"/>
       <w:bookmarkEnd w:id="13"/>
       <w:r>
@@ -3694,7 +3694,7 @@
         <w:pStyle w:val="Heading1"/>
         <w:pageBreakBefore/>
       </w:pPr>
-      <w:bookmarkStart w:id="16" w:name="_Toc243121295"/>
+      <w:bookmarkStart w:id="16" w:name="_Toc243124182"/>
       <w:bookmarkStart w:id="17" w:name="methodology"/>
       <w:bookmarkEnd w:id="11"/>
       <w:bookmarkEnd w:id="15"/>
@@ -3708,7 +3708,7 @@
       <w:pPr>
         <w:pStyle w:val="Heading2"/>
       </w:pPr>
-      <w:bookmarkStart w:id="18" w:name="_Toc243121296"/>
+      <w:bookmarkStart w:id="18" w:name="_Toc243124183"/>
       <w:bookmarkStart w:id="19" w:name="proposed-approach"/>
       <w:r>
         <w:t>3.1  Proposed Approach</w:t>
@@ -3727,7 +3727,7 @@
       <w:pPr>
         <w:pStyle w:val="Heading2"/>
       </w:pPr>
-      <w:bookmarkStart w:id="20" w:name="_Toc243121297"/>
+      <w:bookmarkStart w:id="20" w:name="_Toc243124184"/>
       <w:bookmarkStart w:id="21" w:name="dataset-description"/>
       <w:bookmarkEnd w:id="19"/>
       <w:r>
@@ -3935,7 +3935,7 @@
       <w:pPr>
         <w:pStyle w:val="Heading2"/>
       </w:pPr>
-      <w:bookmarkStart w:id="22" w:name="_Toc243121298"/>
+      <w:bookmarkStart w:id="22" w:name="_Toc243124185"/>
       <w:bookmarkStart w:id="23" w:name="algorithms-and-technologies"/>
       <w:bookmarkEnd w:id="21"/>
       <w:r>
@@ -5550,7 +5550,7 @@
       <w:pPr>
         <w:pStyle w:val="Heading2"/>
       </w:pPr>
-      <w:bookmarkStart w:id="24" w:name="_Toc243121299"/>
+      <w:bookmarkStart w:id="24" w:name="_Toc243124186"/>
       <w:bookmarkStart w:id="25" w:name="pos-aware-suggestion-filtering"/>
       <w:bookmarkEnd w:id="23"/>
       <w:r>
@@ -5782,7 +5782,7 @@
       <w:pPr>
         <w:pStyle w:val="Heading2"/>
       </w:pPr>
-      <w:bookmarkStart w:id="26" w:name="_Toc243121300"/>
+      <w:bookmarkStart w:id="26" w:name="_Toc243124187"/>
       <w:bookmarkStart w:id="27" w:name="system-workflow"/>
       <w:bookmarkEnd w:id="25"/>
       <w:r>
@@ -5800,7 +5800,7 @@
           <w:noProof/>
         </w:rPr>
         <w:drawing>
-          <wp:inline distT="0" distB="0" distL="0" distR="0" wp14:anchorId="0871DDE9" wp14:editId="135ADBBC">
+          <wp:inline distT="0" distB="0" distL="0" distR="0" wp14:anchorId="7C542AD7" wp14:editId="43FC6926">
             <wp:extent cx="5067300" cy="903472"/>
             <wp:effectExtent l="0" t="0" r="0" b="0"/>
             <wp:docPr id="24" name="Picture"/>
@@ -5856,7 +5856,7 @@
         <w:pStyle w:val="Heading1"/>
         <w:pageBreakBefore/>
       </w:pPr>
-      <w:bookmarkStart w:id="28" w:name="_Toc243121301"/>
+      <w:bookmarkStart w:id="28" w:name="_Toc243124188"/>
       <w:bookmarkStart w:id="29" w:name="experimental-details-and-results"/>
       <w:bookmarkEnd w:id="17"/>
       <w:bookmarkEnd w:id="27"/>
@@ -5870,7 +5870,7 @@
       <w:pPr>
         <w:pStyle w:val="Heading2"/>
       </w:pPr>
-      <w:bookmarkStart w:id="30" w:name="_Toc243121302"/>
+      <w:bookmarkStart w:id="30" w:name="_Toc243124189"/>
       <w:bookmarkStart w:id="31" w:name="experimental-environment"/>
       <w:r>
         <w:t>4.1  Experimental Environment</w:t>
@@ -5971,7 +5971,7 @@
       <w:pPr>
         <w:pStyle w:val="Heading2"/>
       </w:pPr>
-      <w:bookmarkStart w:id="32" w:name="_Toc243121303"/>
+      <w:bookmarkStart w:id="32" w:name="_Toc243124190"/>
       <w:bookmarkStart w:id="33" w:name="evaluation-metrics"/>
       <w:bookmarkEnd w:id="31"/>
       <w:r>
@@ -6201,7 +6201,7 @@
       <w:pPr>
         <w:pStyle w:val="Heading2"/>
       </w:pPr>
-      <w:bookmarkStart w:id="34" w:name="_Toc243121304"/>
+      <w:bookmarkStart w:id="34" w:name="_Toc243124191"/>
       <w:bookmarkStart w:id="35" w:name="evaluation-set-generation"/>
       <w:bookmarkEnd w:id="33"/>
       <w:r>
@@ -6230,7 +6230,7 @@
       <w:pPr>
         <w:pStyle w:val="Heading2"/>
       </w:pPr>
-      <w:bookmarkStart w:id="36" w:name="_Toc243121305"/>
+      <w:bookmarkStart w:id="36" w:name="_Toc243124192"/>
       <w:bookmarkStart w:id="37" w:name="experimental-results"/>
       <w:bookmarkEnd w:id="35"/>
       <w:r>
@@ -6878,7 +6878,7 @@
       <w:pPr>
         <w:pStyle w:val="Heading2"/>
       </w:pPr>
-      <w:bookmarkStart w:id="38" w:name="_Toc243121306"/>
+      <w:bookmarkStart w:id="38" w:name="_Toc243124193"/>
       <w:bookmarkStart w:id="39" w:name="confusion-matrix"/>
       <w:bookmarkEnd w:id="37"/>
       <w:r>
@@ -6905,7 +6905,7 @@
         </w:rPr>
         <w:lastRenderedPageBreak/>
         <w:drawing>
-          <wp:inline distT="0" distB="0" distL="0" distR="0" wp14:anchorId="1FAC7598" wp14:editId="362807D5">
+          <wp:inline distT="0" distB="0" distL="0" distR="0" wp14:anchorId="455AB823" wp14:editId="4456EEAE">
             <wp:extent cx="4160520" cy="3566160"/>
             <wp:effectExtent l="0" t="0" r="0" b="0"/>
             <wp:docPr id="33" name="Picture"/>
@@ -6968,7 +6968,7 @@
       <w:pPr>
         <w:pStyle w:val="Heading2"/>
       </w:pPr>
-      <w:bookmarkStart w:id="40" w:name="_Toc243121307"/>
+      <w:bookmarkStart w:id="40" w:name="_Toc243124194"/>
       <w:bookmarkStart w:id="41" w:name="output-screenshots"/>
       <w:bookmarkEnd w:id="39"/>
       <w:r>
@@ -6987,7 +6987,7 @@
           <w:noProof/>
         </w:rPr>
         <w:drawing>
-          <wp:inline distT="0" distB="0" distL="0" distR="0" wp14:anchorId="38C15863" wp14:editId="6C6897EB">
+          <wp:inline distT="0" distB="0" distL="0" distR="0" wp14:anchorId="560F6C7D" wp14:editId="28C1EB1A">
             <wp:extent cx="4533900" cy="4639339"/>
             <wp:effectExtent l="0" t="0" r="0" b="0"/>
             <wp:docPr id="37" name="Picture"/>
@@ -7076,7 +7076,7 @@
         <w:pStyle w:val="Heading1"/>
         <w:pageBreakBefore/>
       </w:pPr>
-      <w:bookmarkStart w:id="42" w:name="_Toc243121308"/>
+      <w:bookmarkStart w:id="42" w:name="_Toc243124195"/>
       <w:bookmarkStart w:id="43" w:name="error-analysis"/>
       <w:bookmarkEnd w:id="29"/>
       <w:bookmarkEnd w:id="41"/>
@@ -7090,7 +7090,7 @@
       <w:pPr>
         <w:pStyle w:val="Heading2"/>
       </w:pPr>
-      <w:bookmarkStart w:id="44" w:name="_Toc243121309"/>
+      <w:bookmarkStart w:id="44" w:name="_Toc243124196"/>
       <w:bookmarkStart w:id="45" w:name="observed-errors"/>
       <w:r>
         <w:t>5.1  Observed Errors</w:t>
@@ -7634,7 +7634,7 @@
         <w:t>POS Tagger – NOUN confusions.</w:t>
       </w:r>
       <w:r>
-        <w:t xml:space="preserve"> The largest off-diagonal cells in Figure 4.1 are NOUN predicted as ADJ (83), DET (80) and CONJ (72), plus mutual NOUN/VERB confusion (53–57 each way). These are concentrated on lexically ambiguous words (e.g. “that”) where the bigram HMM’s one-tag context window cannot fully disambiguate.</w:t>
+        <w:t xml:space="preserve"> The largest off-diagonal cells in Figure 4.1 are NOUN predicted as ADJ (83), DET (80) and CONJ (72), plus mutual NOUN/VERB confusion (53–57 each way). These are concentrated on words that can be either a noun or an adjective (e.g. “green”, “public”) or a noun or a verb (“cut”, “show”), and on proper names never seen in training (124 of the 429 NOUN errors), where the bigram HMM’s one-tag context window cannot fully disambiguate. Ambiguous function words such as “that” cause a separate, smaller set of DET/PRON/ADP errors.</w:t>
       </w:r>
     </w:p>
     <w:p>
@@ -7656,7 +7656,7 @@
       <w:pPr>
         <w:pStyle w:val="Heading2"/>
       </w:pPr>
-      <w:bookmarkStart w:id="46" w:name="_Toc243121310"/>
+      <w:bookmarkStart w:id="46" w:name="_Toc243124197"/>
       <w:bookmarkStart w:id="47" w:name="possible-causes"/>
       <w:bookmarkEnd w:id="45"/>
       <w:r>
@@ -7683,6 +7683,7 @@
         </w:numPr>
       </w:pPr>
       <w:r>
+        <w:lastRenderedPageBreak/>
         <w:t>The corrector looks at each word in isolation, so a typo that happens to form another real word (“gill” for “will”) is never flagged. Catching these needs the sentence context (a real-word error model).</w:t>
       </w:r>
     </w:p>
@@ -7694,7 +7695,6 @@
         </w:numPr>
       </w:pPr>
       <w:r>
-        <w:lastRenderedPageBreak/>
         <w:t>The confusion matrix is sparse: 12,356 single-edit training pairs spread over roughly 2,700 possible (character, edit) combinations, so many specific edits have only a handful of counts.</w:t>
       </w:r>
     </w:p>
@@ -7894,7 +7894,7 @@
       <w:pPr>
         <w:pStyle w:val="Heading2"/>
       </w:pPr>
-      <w:bookmarkStart w:id="48" w:name="_Toc243121311"/>
+      <w:bookmarkStart w:id="48" w:name="_Toc243124198"/>
       <w:bookmarkStart w:id="49" w:name="improvement-strategies"/>
       <w:bookmarkEnd w:id="47"/>
       <w:r>
@@ -8058,7 +8058,7 @@
         <w:pStyle w:val="Heading1"/>
         <w:pageBreakBefore/>
       </w:pPr>
-      <w:bookmarkStart w:id="50" w:name="_Toc243121312"/>
+      <w:bookmarkStart w:id="50" w:name="_Toc243124199"/>
       <w:bookmarkStart w:id="51" w:name="X8e33f9097ff1185607ebd5024202a1961ff5a9c"/>
       <w:bookmarkEnd w:id="43"/>
       <w:bookmarkEnd w:id="49"/>
@@ -8072,7 +8072,7 @@
       <w:pPr>
         <w:pStyle w:val="Heading2"/>
       </w:pPr>
-      <w:bookmarkStart w:id="52" w:name="_Toc243121313"/>
+      <w:bookmarkStart w:id="52" w:name="_Toc243124200"/>
       <w:bookmarkStart w:id="53" w:name="github-repository"/>
       <w:r>
         <w:t>6.1  GitHub Repository</w:t>
@@ -8125,7 +8125,7 @@
       <w:pPr>
         <w:pStyle w:val="Heading2"/>
       </w:pPr>
-      <w:bookmarkStart w:id="54" w:name="_Toc243121314"/>
+      <w:bookmarkStart w:id="54" w:name="_Toc243124201"/>
       <w:bookmarkStart w:id="55" w:name="deployment-evidence"/>
       <w:bookmarkEnd w:id="53"/>
       <w:r>
@@ -8254,7 +8254,7 @@
       <w:pPr>
         <w:pStyle w:val="Heading2"/>
       </w:pPr>
-      <w:bookmarkStart w:id="56" w:name="_Toc243121315"/>
+      <w:bookmarkStart w:id="56" w:name="_Toc243124202"/>
       <w:bookmarkStart w:id="57" w:name="deployed-application-screenshot"/>
       <w:bookmarkEnd w:id="55"/>
       <w:r>
@@ -8275,7 +8275,7 @@
         <w:pStyle w:val="Heading1"/>
         <w:pageBreakBefore/>
       </w:pPr>
-      <w:bookmarkStart w:id="58" w:name="_Toc243121316"/>
+      <w:bookmarkStart w:id="58" w:name="_Toc243124203"/>
       <w:bookmarkStart w:id="59" w:name="conclusion-and-future-work"/>
       <w:bookmarkEnd w:id="51"/>
       <w:bookmarkEnd w:id="57"/>
@@ -8289,7 +8289,7 @@
       <w:pPr>
         <w:pStyle w:val="Heading2"/>
       </w:pPr>
-      <w:bookmarkStart w:id="60" w:name="_Toc243121317"/>
+      <w:bookmarkStart w:id="60" w:name="_Toc243124204"/>
       <w:bookmarkStart w:id="61" w:name="conclusion"/>
       <w:r>
         <w:t>7.1  Conclusion</w:t>
@@ -8316,7 +8316,7 @@
       <w:pPr>
         <w:pStyle w:val="Heading2"/>
       </w:pPr>
-      <w:bookmarkStart w:id="62" w:name="_Toc243121318"/>
+      <w:bookmarkStart w:id="62" w:name="_Toc243124205"/>
       <w:bookmarkStart w:id="63" w:name="future-work"/>
       <w:bookmarkEnd w:id="61"/>
       <w:r>
@@ -8384,7 +8384,7 @@
         <w:pStyle w:val="Heading1"/>
         <w:pageBreakBefore/>
       </w:pPr>
-      <w:bookmarkStart w:id="64" w:name="_Toc243121319"/>
+      <w:bookmarkStart w:id="64" w:name="_Toc243124206"/>
       <w:bookmarkStart w:id="65" w:name="acknowledgement-of-ai-usage"/>
       <w:bookmarkEnd w:id="59"/>
       <w:bookmarkEnd w:id="63"/>
@@ -8398,7 +8398,7 @@
       <w:pPr>
         <w:pStyle w:val="Heading2"/>
       </w:pPr>
-      <w:bookmarkStart w:id="66" w:name="_Toc243121320"/>
+      <w:bookmarkStart w:id="66" w:name="_Toc243124207"/>
       <w:bookmarkStart w:id="67" w:name="ai-usage-statement"/>
       <w:r>
         <w:t>8.1  AI Usage Statement</w:t>
@@ -8418,7 +8418,7 @@
         <w:pStyle w:val="Heading1"/>
         <w:pageBreakBefore/>
       </w:pPr>
-      <w:bookmarkStart w:id="68" w:name="_Toc243121321"/>
+      <w:bookmarkStart w:id="68" w:name="_Toc243124208"/>
       <w:bookmarkStart w:id="69" w:name="bibliography"/>
       <w:bookmarkEnd w:id="65"/>
       <w:bookmarkEnd w:id="67"/>
@@ -8727,7 +8727,7 @@
   <w:abstractNum w:abstractNumId="0" w15:restartNumberingAfterBreak="0">
     <w:nsid w:val="0000A990"/>
     <w:multiLevelType w:val="multilevel"/>
-    <w:tmpl w:val="01B6023A"/>
+    <w:tmpl w:val="72C67702"/>
     <w:lvl w:ilvl="0">
       <w:numFmt w:val="bullet"/>
       <w:lvlText w:val=" "/>
@@ -8804,7 +8804,7 @@
   <w:abstractNum w:abstractNumId="1" w15:restartNumberingAfterBreak="0">
     <w:nsid w:val="0000A991"/>
     <w:multiLevelType w:val="multilevel"/>
-    <w:tmpl w:val="6480EC9A"/>
+    <w:tmpl w:val="0BB0D554"/>
     <w:lvl w:ilvl="0">
       <w:numFmt w:val="bullet"/>
       <w:lvlText w:val=""/>
@@ -8908,7 +8908,7 @@
   <w:abstractNum w:abstractNumId="2" w15:restartNumberingAfterBreak="0">
     <w:nsid w:val="00A99201"/>
     <w:multiLevelType w:val="multilevel"/>
-    <w:tmpl w:val="7FB60D12"/>
+    <w:tmpl w:val="445C0B5C"/>
     <w:lvl w:ilvl="0">
       <w:start w:val="1"/>
       <w:numFmt w:val="decimal"/>
@@ -8991,13 +8991,13 @@
       </w:pPr>
     </w:lvl>
   </w:abstractNum>
-  <w:num w:numId="1" w16cid:durableId="1071198506">
+  <w:num w:numId="1" w16cid:durableId="1204708484">
     <w:abstractNumId w:val="0"/>
   </w:num>
-  <w:num w:numId="2" w16cid:durableId="1310666171">
+  <w:num w:numId="2" w16cid:durableId="1048915661">
     <w:abstractNumId w:val="1"/>
   </w:num>
-  <w:num w:numId="3" w16cid:durableId="1380662219">
+  <w:num w:numId="3" w16cid:durableId="1666469840">
     <w:abstractNumId w:val="2"/>
     <w:lvlOverride w:ilvl="0">
       <w:startOverride w:val="1"/>
@@ -9027,31 +9027,31 @@
       <w:startOverride w:val="1"/>
     </w:lvlOverride>
   </w:num>
-  <w:num w:numId="4" w16cid:durableId="2000309384">
+  <w:num w:numId="4" w16cid:durableId="602149945">
     <w:abstractNumId w:val="1"/>
   </w:num>
-  <w:num w:numId="5" w16cid:durableId="1681081540">
+  <w:num w:numId="5" w16cid:durableId="434642117">
     <w:abstractNumId w:val="1"/>
   </w:num>
-  <w:num w:numId="6" w16cid:durableId="717051172">
+  <w:num w:numId="6" w16cid:durableId="431123694">
     <w:abstractNumId w:val="1"/>
   </w:num>
-  <w:num w:numId="7" w16cid:durableId="1507592540">
+  <w:num w:numId="7" w16cid:durableId="1476294793">
     <w:abstractNumId w:val="1"/>
   </w:num>
-  <w:num w:numId="8" w16cid:durableId="745959872">
+  <w:num w:numId="8" w16cid:durableId="28385053">
     <w:abstractNumId w:val="1"/>
   </w:num>
-  <w:num w:numId="9" w16cid:durableId="14423707">
+  <w:num w:numId="9" w16cid:durableId="1440221713">
     <w:abstractNumId w:val="1"/>
   </w:num>
-  <w:num w:numId="10" w16cid:durableId="953706538">
+  <w:num w:numId="10" w16cid:durableId="1551763171">
     <w:abstractNumId w:val="1"/>
   </w:num>
-  <w:num w:numId="11" w16cid:durableId="1434671665">
+  <w:num w:numId="11" w16cid:durableId="1776830657">
     <w:abstractNumId w:val="1"/>
   </w:num>
-  <w:num w:numId="12" w16cid:durableId="801311532">
+  <w:num w:numId="12" w16cid:durableId="5207447">
     <w:abstractNumId w:val="2"/>
     <w:lvlOverride w:ilvl="0">
       <w:startOverride w:val="1"/>
@@ -9081,7 +9081,7 @@
       <w:startOverride w:val="1"/>
     </w:lvlOverride>
   </w:num>
-  <w:num w:numId="13" w16cid:durableId="1649897216">
+  <w:num w:numId="13" w16cid:durableId="1541942375">
     <w:abstractNumId w:val="1"/>
   </w:num>
 </w:numbering>
@@ -10333,7 +10333,7 @@
     <w:name w:val="header"/>
     <w:basedOn w:val="Normal"/>
     <w:link w:val="HeaderChar"/>
-    <w:rsid w:val="00F3549B"/>
+    <w:rsid w:val="00002135"/>
     <w:pPr>
       <w:tabs>
         <w:tab w:val="center" w:pos="4513"/>
@@ -10346,7 +10346,7 @@
     <w:name w:val="Header Char"/>
     <w:basedOn w:val="DefaultParagraphFont"/>
     <w:link w:val="Header"/>
-    <w:rsid w:val="00F3549B"/>
+    <w:rsid w:val="00002135"/>
     <w:rPr>
       <w:rFonts w:ascii="Cambria" w:eastAsia="Cambria" w:hAnsi="Cambria"/>
     </w:rPr>
@@ -10355,7 +10355,7 @@
     <w:name w:val="footer"/>
     <w:basedOn w:val="Normal"/>
     <w:link w:val="FooterChar"/>
-    <w:rsid w:val="00F3549B"/>
+    <w:rsid w:val="00002135"/>
     <w:pPr>
       <w:tabs>
         <w:tab w:val="center" w:pos="4513"/>
@@ -10368,7 +10368,7 @@
     <w:name w:val="Footer Char"/>
     <w:basedOn w:val="DefaultParagraphFont"/>
     <w:link w:val="Footer"/>
-    <w:rsid w:val="00F3549B"/>
+    <w:rsid w:val="00002135"/>
     <w:rPr>
       <w:rFonts w:ascii="Cambria" w:eastAsia="Cambria" w:hAnsi="Cambria"/>
     </w:rPr>
@@ -10379,7 +10379,7 @@
     <w:next w:val="Normal"/>
     <w:autoRedefine/>
     <w:uiPriority w:val="39"/>
-    <w:rsid w:val="00F3549B"/>
+    <w:rsid w:val="00002135"/>
     <w:pPr>
       <w:spacing w:after="100"/>
     </w:pPr>
@@ -10390,7 +10390,7 @@
     <w:next w:val="Normal"/>
     <w:autoRedefine/>
     <w:uiPriority w:val="39"/>
-    <w:rsid w:val="00F3549B"/>
+    <w:rsid w:val="00002135"/>
     <w:pPr>
       <w:spacing w:after="100"/>
       <w:ind w:left="240"/>

</xml_diff>